<commit_message>
docs: add Ingerman 2000 reference to writeup; update in-text citation in §2.1
</commit_message>
<xml_diff>
--- a/docs/lebedev_em_writeup.docx
+++ b/docs/lebedev_em_writeup.docx
@@ -325,7 +325,7 @@
           <w:sz w:val="22"/>
           <w:szCs w:val="22"/>
         </w:rPr>
-        <w:t xml:space="preserve">Dual nodes are interleaved using spacings ĥ₁ = h_min/(1+√α) and ĥᵢ = hᵢ/√α for i≥2. The full symmetric grid is formed by mirroring the positive half-axis, giving Mx = My = 4k intervals. The optimal-grid theory underlying this construction — including the choice γ = 1/√2 for EM diffusion — originates with Druskin and Knizhnerman (1999).</w:t>
+        <w:t xml:space="preserve">Dual nodes are interleaved using spacings ĥ₁ = h_min/(1+√α) and ĥᵢ = hᵢ/√α for i≥2. The full symmetric grid is formed by mirroring the positive half-axis, giving Mx = My = 4k intervals. The optimal-grid theory underlying this construction — including the choice γ = 1/√2 for EM diffusion — originates with Druskin and Knizhnerman (1999) and Ingerman, Druskin, and Knizhnerman (2000).</w:t>
       </w:r>
     </w:p>
     <w:p>
@@ -6325,6 +6325,24 @@
           <w:szCs w:val="22"/>
         </w:rPr>
         <w:t xml:space="preserve">Druskin, V., &amp; Knizhnerman, L. (1999). Gaussian spectral rules for the three-point second differences: I. A two-point positive definite problem in a semi-infinite domain. SIAM Journal on Numerical Analysis, 37(2), 403–422.</w:t>
+      </w:r>
+    </w:p>
+    <w:p>
+      <w:pPr>
+        <w:spacing w:after="60" w:before="60"/>
+      </w:pPr>
+    </w:p>
+    <w:p>
+      <w:pPr>
+        <w:spacing w:after="80" w:before="80"/>
+      </w:pPr>
+      <w:r>
+        <w:rPr>
+          <w:rFonts w:ascii="Arial" w:cs="Arial" w:eastAsia="Arial" w:hAnsi="Arial"/>
+          <w:sz w:val="22"/>
+          <w:szCs w:val="22"/>
+        </w:rPr>
+        <w:t xml:space="preserve">Ingerman, D., Druskin, V., &amp; Knizhnerman, L. (2000). Optimal finite difference grids and rational approximations of the square root I. Elliptic problems. SIAM Journal on Numerical Analysis, 38(5), 1603–1625.</w:t>
       </w:r>
     </w:p>
     <w:p>

</xml_diff>